<commit_message>
Adota 3DCoatTextura 2026 e adiciona guias de migração do Substance
- Substitui 3D Coat por 3DCoatTextura 2026 em planos de aula, slides,
  cronograma, plano de ensino, rubrica e guia do professor
- Remove referências à UV Room (inexistente no Textura) e ao formato .3dc
- Corrige a distribuição de tempo do estúdio do Encontro 2 da Semana 7
- Adiciona ao menu Recursos: Guia de Migração Substance → 3DCoatTextura,
  Features do 3DCoatTextura por Trilha e Cursos e Playlists

Co-Authored-By: Claude Opus 5.5 <noreply@anthropic.com>
Claude-Session: https://claude.ai/code/session_01T9absvATDMQs7QJBvooSVj
</commit_message>
<xml_diff>
--- a/Cronograma/cronograma_texturizacao.docx
+++ b/Cronograma/cronograma_texturizacao.docx
@@ -430,7 +430,7 @@
                 <w:sz w:val="18"/>
                 <w:szCs w:val="18"/>
               </w:rPr>
-              <w:t xml:space="preserve">O que é textura e material em computação gráfica? Diferença entre raster e procedural. Apresentação do pipeline Blender → 3D Coat → Unity. Introdução ao projeto semestral (Kit Modular de Ambiente).</w:t>
+              <w:t xml:space="preserve">O que é textura e material em computação gráfica? Diferença entre raster e procedural. Apresentação do pipeline Blender → 3DCoatTextura → Unity. Introdução ao projeto semestral (Kit Modular de Ambiente).</w:t>
             </w:r>
           </w:p>
         </w:tc>
@@ -4222,7 +4222,7 @@
                 <w:sz w:val="18"/>
                 <w:szCs w:val="18"/>
               </w:rPr>
-              <w:t xml:space="preserve">Workflow no 3D Coat: camadas, projeção e exportação PBR</w:t>
+              <w:t xml:space="preserve">Workflow no 3DCoatTextura: camadas, projeção e exportação PBR</w:t>
             </w:r>
           </w:p>
         </w:tc>
@@ -4286,7 +4286,7 @@
                 <w:sz w:val="18"/>
                 <w:szCs w:val="18"/>
               </w:rPr>
-              <w:t xml:space="preserve">Cap. 6 — Introdução ao 3D Coat; Workflow de texturização PBR: camadas e exportação</w:t>
+              <w:t xml:space="preserve">Cap. 6 — Introdução ao 3DCoatTextura; Workflow de texturização PBR: camadas e exportação</w:t>
             </w:r>
           </w:p>
         </w:tc>
@@ -4357,7 +4357,7 @@
                 <w:sz w:val="18"/>
                 <w:szCs w:val="18"/>
               </w:rPr>
-              <w:t xml:space="preserve">Tour pelo 3D Coat: Paint Room, UV Room, Render Room. Sistema de camadas e canais PBR. Importação de mesh com UV do Blender e exportação de mapas.</w:t>
+              <w:t xml:space="preserve">Tour pelo 3DCoatTextura 2026: Paint Room e Render Room (conferência de UV na janela Texture Editor). Sistema de camadas e canais PBR. Importação de mesh com UV do Blender e exportação de mapas.</w:t>
             </w:r>
           </w:p>
         </w:tc>
@@ -4428,7 +4428,7 @@
                 <w:sz w:val="18"/>
                 <w:szCs w:val="18"/>
               </w:rPr>
-              <w:t xml:space="preserve">Importação de um asset com UV pronto para o 3D Coat. Pintura de camadas de Albedo, Roughness e Metallic. Exportação de mapas PBR e configuração no Blender.</w:t>
+              <w:t xml:space="preserve">Importação de um asset com UV pronto para o 3DCoatTextura. Pintura de camadas de Albedo, Roughness e Metallic. Exportação de mapas PBR e configuração no Blender.</w:t>
             </w:r>
           </w:p>
         </w:tc>
@@ -4499,7 +4499,7 @@
                 <w:sz w:val="18"/>
                 <w:szCs w:val="18"/>
               </w:rPr>
-              <w:t xml:space="preserve">Importar um dos assets do kit para o 3D Coat e iniciar a texturização PBR por camadas. Aplicar cor base, roughness e metallic coerentes com o tema.</w:t>
+              <w:t xml:space="preserve">Importar um dos assets do kit para o 3DCoatTextura e iniciar a texturização PBR por camadas. Aplicar cor base, roughness e metallic coerentes com o tema.</w:t>
             </w:r>
           </w:p>
         </w:tc>
@@ -4564,7 +4564,7 @@
                 <w:sz w:val="18"/>
                 <w:szCs w:val="18"/>
               </w:rPr>
-              <w:t xml:space="preserve">Asset 01 texturizado no 3D Coat: exportação dos mapas PBR (Albedo, Metallic, Roughness) e material configurado no Blender.</w:t>
+              <w:t xml:space="preserve">Asset 01 texturizado no 3DCoatTextura: exportação dos mapas PBR (Albedo, Metallic, Roughness) e material configurado no Blender.</w:t>
             </w:r>
           </w:p>
         </w:tc>
@@ -4783,7 +4783,7 @@
                 <w:sz w:val="18"/>
                 <w:szCs w:val="18"/>
               </w:rPr>
-              <w:t xml:space="preserve">Texturização artística por pintura digital no 3D Coat</w:t>
+              <w:t xml:space="preserve">Texturização artística por pintura digital no 3DCoatTextura</w:t>
             </w:r>
           </w:p>
         </w:tc>
@@ -4847,7 +4847,7 @@
                 <w:sz w:val="18"/>
                 <w:szCs w:val="18"/>
               </w:rPr>
-              <w:t xml:space="preserve">Cap. 7 — Pintura digital aplicada a texturas; Ferramentas de pintura no 3D Coat</w:t>
+              <w:t xml:space="preserve">Cap. 7 — Pintura digital aplicada a texturas; Ferramentas de pintura no 3DCoatTextura</w:t>
             </w:r>
           </w:p>
         </w:tc>
@@ -4989,7 +4989,7 @@
                 <w:sz w:val="18"/>
                 <w:szCs w:val="18"/>
               </w:rPr>
-              <w:t xml:space="preserve">Pintura de desgaste e variação de cor em um material metálico no 3D Coat. Técnicas de edge wear, dirt e scratches com pincéis e alphas.</w:t>
+              <w:t xml:space="preserve">Pintura de desgaste e variação de cor em um material metálico no 3DCoatTextura. Técnicas de edge wear, dirt e scratches com pincéis e alphas.</w:t>
             </w:r>
           </w:p>
         </w:tc>
@@ -5408,7 +5408,7 @@
                 <w:sz w:val="18"/>
                 <w:szCs w:val="18"/>
               </w:rPr>
-              <w:t xml:space="preserve">Cap. 7 — Uso de stencils no 3D Coat; Criação e importação de alphas</w:t>
+              <w:t xml:space="preserve">Cap. 7 — Uso de stencils no 3DCoatTextura; Criação e importação de alphas</w:t>
             </w:r>
           </w:p>
         </w:tc>
@@ -5550,7 +5550,7 @@
                 <w:sz w:val="18"/>
                 <w:szCs w:val="18"/>
               </w:rPr>
-              <w:t xml:space="preserve">Aplicação de stencil de rachaduras em uma superfície de pedra no 3D Coat. Criação de um stencil personalizado no Krita e importação.</w:t>
+              <w:t xml:space="preserve">Aplicação de stencil de rachaduras em uma superfície de pedra no 3DCoatTextura. Criação de um stencil personalizado no Krita e importação.</w:t>
             </w:r>
           </w:p>
         </w:tc>
@@ -6182,7 +6182,7 @@
                 <w:sz w:val="18"/>
                 <w:szCs w:val="18"/>
               </w:rPr>
-              <w:t xml:space="preserve">Os estudantes criam uma versão high-poly de detalhe de um asset e executam o bake de Normal Map e AO. Integração do Normal Map baked ao material no 3D Coat.</w:t>
+              <w:t xml:space="preserve">Os estudantes criam uma versão high-poly de detalhe de um asset e executam o bake de Normal Map e AO. Integração do Normal Map baked ao material no 3DCoatTextura.</w:t>
             </w:r>
           </w:p>
         </w:tc>
@@ -6530,7 +6530,7 @@
                 <w:sz w:val="18"/>
                 <w:szCs w:val="18"/>
               </w:rPr>
-              <w:t xml:space="preserve">Cap. 8 — ID Map e Curvature Map; Uso de bakes como base de mascaramento no 3D Coat</w:t>
+              <w:t xml:space="preserve">Cap. 8 — ID Map e Curvature Map; Uso de bakes como base de mascaramento no 3DCoatTextura</w:t>
             </w:r>
           </w:p>
         </w:tc>
@@ -6601,7 +6601,7 @@
                 <w:sz w:val="18"/>
                 <w:szCs w:val="18"/>
               </w:rPr>
-              <w:t xml:space="preserve">ID Map: criação e uso para mascaramento por material. Curvature Map: detecção de arestas e cavidades. Integração do pacote de bakes no 3D Coat como base de geração de detalhe automático.</w:t>
+              <w:t xml:space="preserve">ID Map: criação e uso para mascaramento por material. Curvature Map: detecção de arestas e cavidades. Integração do pacote de bakes no 3DCoatTextura como base de geração de detalhe automático.</w:t>
             </w:r>
           </w:p>
         </w:tc>
@@ -6672,7 +6672,7 @@
                 <w:sz w:val="18"/>
                 <w:szCs w:val="18"/>
               </w:rPr>
-              <w:t xml:space="preserve">Configuração de bake de ID Map com materiais coloridos no Blender. Importação do pacote de bakes no 3D Coat e uso do Curvature Map para edge highlight e cavity dirt automáticos.</w:t>
+              <w:t xml:space="preserve">Configuração de bake de ID Map com materiais coloridos no Blender. Importação do pacote de bakes no 3DCoatTextura e uso do Curvature Map para edge highlight e cavity dirt automáticos.</w:t>
             </w:r>
           </w:p>
         </w:tc>
@@ -6743,7 +6743,7 @@
                 <w:sz w:val="18"/>
                 <w:szCs w:val="18"/>
               </w:rPr>
-              <w:t xml:space="preserve">Executar bake completo de um asset (Normal, AO, Curvature, ID Map) e configurar o pacote no 3D Coat. Usar máscaras geradas por bake para distribuir materiais automaticamente.</w:t>
+              <w:t xml:space="preserve">Executar bake completo de um asset (Normal, AO, Curvature, ID Map) e configurar o pacote no 3DCoatTextura. Usar máscaras geradas por bake para distribuir materiais automaticamente.</w:t>
             </w:r>
           </w:p>
         </w:tc>
@@ -6808,7 +6808,7 @@
                 <w:sz w:val="18"/>
                 <w:szCs w:val="18"/>
               </w:rPr>
-              <w:t xml:space="preserve">Pacote completo de bake (4 mapas) de um asset + configuração de material no 3D Coat com uso de máscara por curvature e ID.</w:t>
+              <w:t xml:space="preserve">Pacote completo de bake (4 mapas) de um asset + configuração de material no 3DCoatTextura com uso de máscara por curvature e ID.</w:t>
             </w:r>
           </w:p>
         </w:tc>
@@ -7794,7 +7794,7 @@
                 <w:sz w:val="18"/>
                 <w:szCs w:val="18"/>
               </w:rPr>
-              <w:t xml:space="preserve">Criação de uma Trim Sheet temática no 3D Coat. Mapeamento de asset de parede modular na Trim Sheet (UV elongado). Validação no Blender e Unity.</w:t>
+              <w:t xml:space="preserve">Criação de uma Trim Sheet temática no 3DCoatTextura. Mapeamento de asset de parede modular na Trim Sheet (UV elongado). Validação no Blender e Unity.</w:t>
             </w:r>
           </w:p>
         </w:tc>
@@ -8426,7 +8426,7 @@
                 <w:sz w:val="18"/>
                 <w:szCs w:val="18"/>
               </w:rPr>
-              <w:t xml:space="preserve">Criar um mapa ORM (channel packed) para os assets do kit. Configurar mipmaps no 3D Coat na exportação. Preparar texturas em tamanhos adequados para engine (power of 2).</w:t>
+              <w:t xml:space="preserve">Criar um mapa ORM (channel packed) para os assets do kit. Configurar mipmaps no 3DCoatTextura na exportação. Preparar texturas em tamanhos adequados para engine (power of 2).</w:t>
             </w:r>
           </w:p>
         </w:tc>

</xml_diff>